<commit_message>
chore: merge worktree claude/recursing-goodall-c15324 → main
Intègre les développements de la session Claude Code :
- Synchronisation Tchap par paquet (anti rate-limit)
- Grille salons 6 colonnes × 2 lignes adaptatives
- Relance automatique des invites en attente lors de la synchro
- Retry transparent sur ECONNRESET dans le bridge Matrix
- Fix grille salons : grid-auto-rows:0 + cache-bust assets

Co-Authored-By: Claude Sonnet 4.6 <noreply@anthropic.com>
</commit_message>
<xml_diff>
--- a/docs/fiche-presentation.docx
+++ b/docs/fiche-presentation.docx
@@ -463,6 +463,7 @@
           <w:bCs/>
           <w:color w:val="1A1A1A"/>
         </w:rPr>
+        <w:lastRenderedPageBreak/>
         <w:t>Sécurité  :</w:t>
       </w:r>
       <w:r>
@@ -470,19 +471,6 @@
           <w:color w:val="595959"/>
         </w:rPr>
         <w:t xml:space="preserve"> connexions sécurisées, mots de passe chiffrés, protection contre les tentatives d’intrusion (blocage après 3 essais échoués), jetons anti-falsification sur toutes les actions sensibles</w:t>
-      </w:r>
-    </w:p>
-    <w:p>
-      <w:pPr>
-        <w:rPr>
-          <w:color w:val="595959"/>
-        </w:rPr>
-      </w:pPr>
-      <w:r>
-        <w:rPr>
-          <w:color w:val="595959"/>
-        </w:rPr>
-        <w:br w:type="page"/>
       </w:r>
     </w:p>
     <w:p>
@@ -493,7 +481,6 @@
         </w:pBdr>
       </w:pPr>
       <w:r>
-        <w:lastRenderedPageBreak/>
         <w:t>3. Bénéfices</w:t>
       </w:r>
     </w:p>
@@ -735,12 +722,6 @@
         <w:gridCol w:w="2320"/>
       </w:tblGrid>
       <w:tr>
-        <w:tblPrEx>
-          <w:tblCellMar>
-            <w:top w:w="0" w:type="dxa"/>
-            <w:bottom w:w="0" w:type="dxa"/>
-          </w:tblCellMar>
-        </w:tblPrEx>
         <w:trPr>
           <w:jc w:val="center"/>
         </w:trPr>
@@ -836,12 +817,6 @@
         </w:tc>
       </w:tr>
       <w:tr>
-        <w:tblPrEx>
-          <w:tblCellMar>
-            <w:top w:w="0" w:type="dxa"/>
-            <w:bottom w:w="0" w:type="dxa"/>
-          </w:tblCellMar>
-        </w:tblPrEx>
         <w:trPr>
           <w:jc w:val="center"/>
         </w:trPr>
@@ -931,12 +906,6 @@
         </w:tc>
       </w:tr>
       <w:tr>
-        <w:tblPrEx>
-          <w:tblCellMar>
-            <w:top w:w="0" w:type="dxa"/>
-            <w:bottom w:w="0" w:type="dxa"/>
-          </w:tblCellMar>
-        </w:tblPrEx>
         <w:trPr>
           <w:jc w:val="center"/>
         </w:trPr>
@@ -1026,12 +995,6 @@
         </w:tc>
       </w:tr>
       <w:tr>
-        <w:tblPrEx>
-          <w:tblCellMar>
-            <w:top w:w="0" w:type="dxa"/>
-            <w:bottom w:w="0" w:type="dxa"/>
-          </w:tblCellMar>
-        </w:tblPrEx>
         <w:trPr>
           <w:jc w:val="center"/>
         </w:trPr>
@@ -1121,12 +1084,6 @@
         </w:tc>
       </w:tr>
       <w:tr>
-        <w:tblPrEx>
-          <w:tblCellMar>
-            <w:top w:w="0" w:type="dxa"/>
-            <w:bottom w:w="0" w:type="dxa"/>
-          </w:tblCellMar>
-        </w:tblPrEx>
         <w:trPr>
           <w:jc w:val="center"/>
         </w:trPr>
@@ -1459,18 +1416,8 @@
         <w:bCs/>
         <w:color w:val="1F3864"/>
       </w:rPr>
-      <w:t xml:space="preserve"> Tch</w:t>
+      <w:t xml:space="preserve"> Tchap</w:t>
     </w:r>
-    <w:proofErr w:type="spellStart"/>
-    <w:r>
-      <w:rPr>
-        <w:b/>
-        <w:bCs/>
-        <w:color w:val="1F3864"/>
-      </w:rPr>
-      <w:t>ap</w:t>
-    </w:r>
-    <w:proofErr w:type="spellEnd"/>
     <w:r>
       <w:rPr>
         <w:color w:val="888888"/>

</xml_diff>

<commit_message>
docs: mise à jour fiche-presentation.docx (Messages, Hiérarchie, bénéfice communication)
</commit_message>
<xml_diff>
--- a/docs/fiche-presentation.docx
+++ b/docs/fiche-presentation.docx
@@ -281,6 +281,54 @@
           <w:color w:val="595959"/>
         </w:rPr>
         <w:t xml:space="preserve"> tableau de bord de présence en temps réel</w:t>
+      </w:r>
+    </w:p>
+    <w:p>
+      <w:pPr>
+        <w:pStyle w:val="Paragraphedeliste"/>
+        <w:numPr>
+          <w:ilvl w:val="0"/>
+          <w:numId w:val="2"/>
+        </w:numPr>
+        <w:spacing w:before="60" w:after="60"/>
+      </w:pPr>
+      <w:r>
+        <w:rPr>
+          <w:b/>
+          <w:bCs/>
+          <w:color w:val="1A1A1A"/>
+        </w:rPr>
+        <w:t>Messages :</w:t>
+      </w:r>
+      <w:r>
+        <w:rPr>
+          <w:color w:val="595959"/>
+        </w:rPr>
+        <w:t xml:space="preserve"> composition et envoi de messages formatés (gras, italique, titres, listes, pièces jointes) vers un ou plusieurs salons simultanément</w:t>
+      </w:r>
+    </w:p>
+    <w:p>
+      <w:pPr>
+        <w:pStyle w:val="Paragraphedeliste"/>
+        <w:numPr>
+          <w:ilvl w:val="0"/>
+          <w:numId w:val="2"/>
+        </w:numPr>
+        <w:spacing w:before="60" w:after="60"/>
+      </w:pPr>
+      <w:r>
+        <w:rPr>
+          <w:b/>
+          <w:bCs/>
+          <w:color w:val="1A1A1A"/>
+        </w:rPr>
+        <w:t>Hiérarchie :</w:t>
+      </w:r>
+      <w:r>
+        <w:rPr>
+          <w:color w:val="595959"/>
+        </w:rPr>
+        <w:t xml:space="preserve"> gestion de l’arborescence des unités, attribution d’un bot Tchap dédié par unité, délégation des droits d’administration</w:t>
       </w:r>
     </w:p>
     <w:p>
@@ -532,6 +580,31 @@
           <w:color w:val="595959"/>
         </w:rPr>
         <w:t xml:space="preserve"> le mode crise permet de déployer l’ensemble du personnel dans les salons d’urgence en quelques clics</w:t>
+      </w:r>
+    </w:p>
+    <w:p>
+      <w:pPr>
+        <w:pStyle w:val="Paragraphedeliste"/>
+        <w:numPr>
+          <w:ilvl w:val="0"/>
+          <w:numId w:val="2"/>
+        </w:numPr>
+        <w:spacing w:before="60" w:after="60"/>
+        <w:jc w:val="both"/>
+      </w:pPr>
+      <w:r>
+        <w:rPr>
+          <w:b/>
+          <w:bCs/>
+          <w:color w:val="1A1A1A"/>
+        </w:rPr>
+        <w:t>Communication opérationnelle :</w:t>
+      </w:r>
+      <w:r>
+        <w:rPr>
+          <w:color w:val="595959"/>
+        </w:rPr>
+        <w:t xml:space="preserve"> l’onglet Messages permet d’envoyer en quelques clics un message formaté avec pièces jointes dans plusieurs salons simultanément, sans quitter l’application</w:t>
       </w:r>
     </w:p>
     <w:p>

</xml_diff>